<commit_message>
docs: narrow demo-readiness item 2 to a single retry endpoint
Assessed the two proposed agent-run endpoints and found neither has a caller.
POST /agent-runs has no consumer - the Studio triggers work through
website-integrations/analyze. GET /agent-runs/{id}/events duplicates the
project-wide SSE stream that already ships and that the frontend already
consumes. K Hotels needs neither; the runtime never touches the harness.

The real gap is that FR-100 states every failure is classified and the class
decides the response, but no endpoint acts on it. AgentRun.attempt exists and
nothing increments it. Narrowed item 2 to POST /agent-runs/{run_id}/retry.

Also updates section 4: deterministic embeddings are done, and MODEL_API_KEY is
now the single remaining blocker on the demo path.
</commit_message>
<xml_diff>
--- a/docs/TODO-DEMO-READINESS.docx
+++ b/docs/TODO-DEMO-READINESS.docx
@@ -18,10 +18,10 @@
         <w:rPr>
           <w:b/>
         </w:rPr>
-        <w:t>Companion:</w:t>
+        <w:t>Companions:</w:t>
       </w:r>
       <w:r>
-        <w:t xml:space="preserve"> `TODO-INTEGRATION.md` — the L0–L6 build plan for org-scoped agent &gt; execution (colleague agents + shared runtime agent, per-org policy, channels, evals). &gt; This document is the shorter "what is left before we can demo it" list.</w:t>
+        <w:t xml:space="preserve"> `TODO-INTEGRATION.md` — the L0–L6 build plan for org-scoped agent &gt; execution. `TODO-KHOTELS-EVOLUTION.md` — what K Hotels needs on top of capabilities that &gt; already exist, and which L0/L1/L3 rows this framing supersedes. &gt; This document is the shorter "what is left before we can demo it" list.</w:t>
       </w:r>
     </w:p>
     <w:p>
@@ -34,22 +34,634 @@
     </w:p>
     <w:p>
       <w:r>
-        <w:rPr>
-          <w:b/>
-        </w:rPr>
-        <w:t>Current:</w:t>
-      </w:r>
-      <w:r>
-        <w:t xml:space="preserve"> `DeterministicHashEmbeddingProvider` (lexical, no semantics) </w:t>
+        <w:t xml:space="preserve">&gt; </w:t>
       </w:r>
       <w:r>
         <w:rPr>
           <w:b/>
         </w:rPr>
-        <w:t>Target:</w:t>
+        <w:t>Status: COMPLETE (2026-10-10).</w:t>
       </w:r>
       <w:r>
-        <w:t xml:space="preserve"> `GeminiEmbeddingProvider` (or other real provider) — already scaffolded.</w:t>
+        <w:t xml:space="preserve"> Verified end to end against live Gemini embeddings. &gt; Only the optional quality work below remains.</w:t>
+      </w:r>
+    </w:p>
+    <w:p>
+      <w:r>
+        <w:rPr>
+          <w:b/>
+        </w:rPr>
+        <w:t>What was already true before this task</w:t>
+      </w:r>
+      <w:r>
+        <w:t xml:space="preserve"> (the original plan was written against an older snapshot and was wrong on three of its four rows):</w:t>
+      </w:r>
+    </w:p>
+    <w:p>
+      <w:pPr>
+        <w:pStyle w:val="ListBullet"/>
+      </w:pPr>
+      <w:r>
+        <w:rPr>
+          <w:b/>
+        </w:rPr>
+        <w:t>Factory already wired.</w:t>
+      </w:r>
+      <w:r>
+        <w:t xml:space="preserve"> `app/core/config.py` already defaults to</w:t>
+      </w:r>
+    </w:p>
+    <w:p>
+      <w:r>
+        <w:t>`EMBEDDING_PROVIDER=gemini`, `EMBEDDING_MODEL=gemini-embedding-001`, `EMBEDDING_DIMENSION=768`. `build_default_embedding_provider()` is called at KB creation (`app/api/deps.py:274`); `validate_embedding_configuration()` runs at startup (`app/main.py:90`).</w:t>
+      </w:r>
+    </w:p>
+    <w:p>
+      <w:pPr>
+        <w:pStyle w:val="ListBullet"/>
+      </w:pPr>
+      <w:r>
+        <w:rPr>
+          <w:b/>
+        </w:rPr>
+        <w:t>`GeminiEmbeddingProvider` is complete</w:t>
+      </w:r>
+      <w:r>
+        <w:t>, not a stub — batched at 100, unit-normalised.</w:t>
+      </w:r>
+    </w:p>
+    <w:p>
+      <w:pPr>
+        <w:pStyle w:val="ListBullet"/>
+      </w:pPr>
+      <w:r>
+        <w:rPr>
+          <w:b/>
+        </w:rPr>
+        <w:t>No re-embed migration is needed.</w:t>
+      </w:r>
+      <w:r>
+        <w:t xml:space="preserve"> `knowledge_chunks.embedding` is an *unconstrained*</w:t>
+      </w:r>
+    </w:p>
+    <w:p>
+      <w:r>
+        <w:t>`vector` (migrations 0027/0030), so the 384 → 768 dimension change needs no DDL.</w:t>
+      </w:r>
+    </w:p>
+    <w:p>
+      <w:pPr>
+        <w:pStyle w:val="ListBullet"/>
+      </w:pPr>
+      <w:r>
+        <w:rPr>
+          <w:b/>
+        </w:rPr>
+        <w:t>The deterministic test assertions are correct as written.</w:t>
+      </w:r>
+      <w:r>
+        <w:t xml:space="preserve"> `tests/conftest.py` pins</w:t>
+      </w:r>
+    </w:p>
+    <w:p>
+      <w:r>
+        <w:t>`EMBEDDING_PROVIDER=deterministic` so the suite never calls a paid API. Do not "fix" this.</w:t>
+      </w:r>
+    </w:p>
+    <w:p>
+      <w:r>
+        <w:rPr>
+          <w:b/>
+        </w:rPr>
+        <w:t>What was actually done:</w:t>
+      </w:r>
+    </w:p>
+    <w:p>
+      <w:pPr>
+        <w:pStyle w:val="ListNumber"/>
+      </w:pPr>
+      <w:r>
+        <w:t>`backend/.env` — set `EMBEDDING_API_KEY` (gitignored and untracked; never committed).</w:t>
+      </w:r>
+    </w:p>
+    <w:p>
+      <w:pPr>
+        <w:pStyle w:val="ListNumber"/>
+      </w:pPr>
+      <w:r>
+        <w:t>Seeded the empty database: org → project → knowledge base → document.</w:t>
+      </w:r>
+    </w:p>
+    <w:p>
+      <w:pPr>
+        <w:pStyle w:val="ListNumber"/>
+      </w:pPr>
+      <w:r>
+        <w:rPr>
+          <w:b/>
+        </w:rPr>
+        <w:t>Fixed a real defect in `scripts/seed_knowledge.py`.</w:t>
+      </w:r>
+      <w:r>
+        <w:t xml:space="preserve"> It stored the whole document as a</w:t>
+      </w:r>
+    </w:p>
+    <w:p>
+      <w:r>
+        <w:t>single 1052-character chunk, blending pricing / streaming / sandboxing / framework-detection into one vector. That compressed every score into a 0.42–0.56 band and made retrieval look far worse than it is. It now runs the document through the real `extract_and_chunk_markdown` (3 chunks), batch-embeds, and clears prior chunks so re-running is idempotent.</w:t>
+      </w:r>
+    </w:p>
+    <w:p>
+      <w:r>
+        <w:rPr>
+          <w:b/>
+        </w:rPr>
+        <w:t>Verification</w:t>
+      </w:r>
+      <w:r>
+        <w:t xml:space="preserve"> — paraphrases sharing no literal tokens with the source document:</w:t>
+      </w:r>
+    </w:p>
+    <w:tbl>
+      <w:tblPr>
+        <w:tblStyle w:val="TableGrid"/>
+        <w:tblW w:type="auto" w:w="0"/>
+        <w:jc w:val="center"/>
+        <w:tblLook w:firstColumn="1" w:firstRow="1" w:lastColumn="0" w:lastRow="0" w:noHBand="0" w:noVBand="1" w:val="04A0"/>
+      </w:tblPr>
+      <w:tblGrid>
+        <w:gridCol w:w="3120"/>
+        <w:gridCol w:w="3120"/>
+        <w:gridCol w:w="3120"/>
+      </w:tblGrid>
+      <w:tr>
+        <w:tc>
+          <w:tcPr>
+            <w:tcW w:type="dxa" w:w="3120"/>
+            <w:shd w:val="clear" w:fill="1F3864"/>
+          </w:tcPr>
+          <w:p>
+            <w:r>
+              <w:rPr>
+                <w:rFonts w:ascii="Calibri" w:hAnsi="Calibri"/>
+                <w:b/>
+                <w:color w:val="FFFFFF"/>
+                <w:sz w:val="20"/>
+              </w:rPr>
+            </w:r>
+            <w:r>
+              <w:rPr>
+                <w:rFonts w:ascii="Calibri" w:hAnsi="Calibri"/>
+                <w:b/>
+                <w:color w:val="FFFFFF"/>
+                <w:sz w:val="20"/>
+              </w:rPr>
+              <w:t>Query</w:t>
+            </w:r>
+          </w:p>
+        </w:tc>
+        <w:tc>
+          <w:tcPr>
+            <w:tcW w:type="dxa" w:w="3120"/>
+            <w:shd w:val="clear" w:fill="1F3864"/>
+          </w:tcPr>
+          <w:p>
+            <w:r>
+              <w:rPr>
+                <w:rFonts w:ascii="Calibri" w:hAnsi="Calibri"/>
+                <w:b/>
+                <w:color w:val="FFFFFF"/>
+                <w:sz w:val="20"/>
+              </w:rPr>
+            </w:r>
+            <w:r>
+              <w:rPr>
+                <w:rFonts w:ascii="Calibri" w:hAnsi="Calibri"/>
+                <w:b/>
+                <w:color w:val="FFFFFF"/>
+                <w:sz w:val="20"/>
+              </w:rPr>
+              <w:t>score</w:t>
+            </w:r>
+          </w:p>
+        </w:tc>
+        <w:tc>
+          <w:tcPr>
+            <w:tcW w:type="dxa" w:w="3120"/>
+            <w:shd w:val="clear" w:fill="1F3864"/>
+          </w:tcPr>
+          <w:p>
+            <w:r>
+              <w:rPr>
+                <w:rFonts w:ascii="Calibri" w:hAnsi="Calibri"/>
+                <w:b/>
+                <w:color w:val="FFFFFF"/>
+                <w:sz w:val="20"/>
+              </w:rPr>
+            </w:r>
+            <w:r>
+              <w:rPr>
+                <w:rFonts w:ascii="Calibri" w:hAnsi="Calibri"/>
+                <w:b/>
+                <w:color w:val="FFFFFF"/>
+                <w:sz w:val="20"/>
+              </w:rPr>
+              <w:t>@ threshold 0.55</w:t>
+            </w:r>
+          </w:p>
+        </w:tc>
+      </w:tr>
+      <w:tr>
+        <w:tc>
+          <w:tcPr>
+            <w:tcW w:type="dxa" w:w="3120"/>
+          </w:tcPr>
+          <w:p>
+            <w:r>
+              <w:rPr>
+                <w:rFonts w:ascii="Calibri" w:hAnsi="Calibri"/>
+                <w:sz w:val="20"/>
+              </w:rPr>
+            </w:r>
+            <w:r>
+              <w:rPr>
+                <w:rFonts w:ascii="Calibri" w:hAnsi="Calibri"/>
+                <w:sz w:val="20"/>
+              </w:rPr>
+              <w:t>"What does the premium tier cost per month?"</w:t>
+            </w:r>
+          </w:p>
+        </w:tc>
+        <w:tc>
+          <w:tcPr>
+            <w:tcW w:type="dxa" w:w="3120"/>
+          </w:tcPr>
+          <w:p>
+            <w:r>
+              <w:rPr>
+                <w:rFonts w:ascii="Calibri" w:hAnsi="Calibri"/>
+                <w:sz w:val="20"/>
+              </w:rPr>
+            </w:r>
+            <w:r>
+              <w:rPr>
+                <w:rFonts w:ascii="Calibri" w:hAnsi="Calibri"/>
+                <w:sz w:val="20"/>
+              </w:rPr>
+              <w:t>0.5593</w:t>
+            </w:r>
+          </w:p>
+        </w:tc>
+        <w:tc>
+          <w:tcPr>
+            <w:tcW w:type="dxa" w:w="3120"/>
+          </w:tcPr>
+          <w:p>
+            <w:r>
+              <w:rPr>
+                <w:rFonts w:ascii="Calibri" w:hAnsi="Calibri"/>
+                <w:sz w:val="20"/>
+              </w:rPr>
+            </w:r>
+            <w:r>
+              <w:rPr>
+                <w:rFonts w:ascii="Calibri" w:hAnsi="Calibri"/>
+                <w:sz w:val="20"/>
+              </w:rPr>
+              <w:t>1 match</w:t>
+            </w:r>
+          </w:p>
+        </w:tc>
+      </w:tr>
+      <w:tr>
+        <w:tc>
+          <w:tcPr>
+            <w:tcW w:type="dxa" w:w="3120"/>
+          </w:tcPr>
+          <w:p>
+            <w:r>
+              <w:rPr>
+                <w:rFonts w:ascii="Calibri" w:hAnsi="Calibri"/>
+                <w:sz w:val="20"/>
+              </w:rPr>
+            </w:r>
+            <w:r>
+              <w:rPr>
+                <w:rFonts w:ascii="Calibri" w:hAnsi="Calibri"/>
+                <w:sz w:val="20"/>
+              </w:rPr>
+              <w:t>"how much do customers pay to go live"</w:t>
+            </w:r>
+          </w:p>
+        </w:tc>
+        <w:tc>
+          <w:tcPr>
+            <w:tcW w:type="dxa" w:w="3120"/>
+          </w:tcPr>
+          <w:p>
+            <w:r>
+              <w:rPr>
+                <w:rFonts w:ascii="Calibri" w:hAnsi="Calibri"/>
+                <w:sz w:val="20"/>
+              </w:rPr>
+            </w:r>
+            <w:r>
+              <w:rPr>
+                <w:rFonts w:ascii="Calibri" w:hAnsi="Calibri"/>
+                <w:sz w:val="20"/>
+              </w:rPr>
+              <w:t>0.5893</w:t>
+            </w:r>
+          </w:p>
+        </w:tc>
+        <w:tc>
+          <w:tcPr>
+            <w:tcW w:type="dxa" w:w="3120"/>
+          </w:tcPr>
+          <w:p>
+            <w:r>
+              <w:rPr>
+                <w:rFonts w:ascii="Calibri" w:hAnsi="Calibri"/>
+                <w:sz w:val="20"/>
+              </w:rPr>
+            </w:r>
+            <w:r>
+              <w:rPr>
+                <w:rFonts w:ascii="Calibri" w:hAnsi="Calibri"/>
+                <w:sz w:val="20"/>
+              </w:rPr>
+              <w:t>1 match</w:t>
+            </w:r>
+          </w:p>
+        </w:tc>
+      </w:tr>
+      <w:tr>
+        <w:tc>
+          <w:tcPr>
+            <w:tcW w:type="dxa" w:w="3120"/>
+          </w:tcPr>
+          <w:p>
+            <w:r>
+              <w:rPr>
+                <w:rFonts w:ascii="Calibri" w:hAnsi="Calibri"/>
+                <w:sz w:val="20"/>
+              </w:rPr>
+            </w:r>
+            <w:r>
+              <w:rPr>
+                <w:rFonts w:ascii="Calibri" w:hAnsi="Calibri"/>
+                <w:sz w:val="20"/>
+              </w:rPr>
+              <w:t>"how do you figure out what web technology a site uses"</w:t>
+            </w:r>
+          </w:p>
+        </w:tc>
+        <w:tc>
+          <w:tcPr>
+            <w:tcW w:type="dxa" w:w="3120"/>
+          </w:tcPr>
+          <w:p>
+            <w:r>
+              <w:rPr>
+                <w:rFonts w:ascii="Calibri" w:hAnsi="Calibri"/>
+                <w:sz w:val="20"/>
+              </w:rPr>
+            </w:r>
+            <w:r>
+              <w:rPr>
+                <w:rFonts w:ascii="Calibri" w:hAnsi="Calibri"/>
+                <w:sz w:val="20"/>
+              </w:rPr>
+              <w:t>0.5703</w:t>
+            </w:r>
+          </w:p>
+        </w:tc>
+        <w:tc>
+          <w:tcPr>
+            <w:tcW w:type="dxa" w:w="3120"/>
+          </w:tcPr>
+          <w:p>
+            <w:r>
+              <w:rPr>
+                <w:rFonts w:ascii="Calibri" w:hAnsi="Calibri"/>
+                <w:sz w:val="20"/>
+              </w:rPr>
+            </w:r>
+            <w:r>
+              <w:rPr>
+                <w:rFonts w:ascii="Calibri" w:hAnsi="Calibri"/>
+                <w:sz w:val="20"/>
+              </w:rPr>
+              <w:t>1 match</w:t>
+            </w:r>
+          </w:p>
+        </w:tc>
+      </w:tr>
+      <w:tr>
+        <w:tc>
+          <w:tcPr>
+            <w:tcW w:type="dxa" w:w="3120"/>
+          </w:tcPr>
+          <w:p>
+            <w:r>
+              <w:rPr>
+                <w:rFonts w:ascii="Calibri" w:hAnsi="Calibri"/>
+                <w:sz w:val="20"/>
+              </w:rPr>
+            </w:r>
+            <w:r>
+              <w:rPr>
+                <w:rFonts w:ascii="Calibri" w:hAnsi="Calibri"/>
+                <w:sz w:val="20"/>
+              </w:rPr>
+              <w:t>"does the system touch production code directly"</w:t>
+            </w:r>
+          </w:p>
+        </w:tc>
+        <w:tc>
+          <w:tcPr>
+            <w:tcW w:type="dxa" w:w="3120"/>
+          </w:tcPr>
+          <w:p>
+            <w:r>
+              <w:rPr>
+                <w:rFonts w:ascii="Calibri" w:hAnsi="Calibri"/>
+                <w:sz w:val="20"/>
+              </w:rPr>
+            </w:r>
+            <w:r>
+              <w:rPr>
+                <w:rFonts w:ascii="Calibri" w:hAnsi="Calibri"/>
+                <w:sz w:val="20"/>
+              </w:rPr>
+              <w:t>0.6520</w:t>
+            </w:r>
+          </w:p>
+        </w:tc>
+        <w:tc>
+          <w:tcPr>
+            <w:tcW w:type="dxa" w:w="3120"/>
+          </w:tcPr>
+          <w:p>
+            <w:r>
+              <w:rPr>
+                <w:rFonts w:ascii="Calibri" w:hAnsi="Calibri"/>
+                <w:sz w:val="20"/>
+              </w:rPr>
+            </w:r>
+            <w:r>
+              <w:rPr>
+                <w:rFonts w:ascii="Calibri" w:hAnsi="Calibri"/>
+                <w:sz w:val="20"/>
+              </w:rPr>
+              <w:t>3 matches</w:t>
+            </w:r>
+          </w:p>
+        </w:tc>
+      </w:tr>
+      <w:tr>
+        <w:tc>
+          <w:tcPr>
+            <w:tcW w:type="dxa" w:w="3120"/>
+          </w:tcPr>
+          <w:p>
+            <w:r>
+              <w:rPr>
+                <w:rFonts w:ascii="Calibri" w:hAnsi="Calibri"/>
+                <w:sz w:val="20"/>
+              </w:rPr>
+            </w:r>
+            <w:r>
+              <w:rPr>
+                <w:rFonts w:ascii="Calibri" w:hAnsi="Calibri"/>
+                <w:sz w:val="20"/>
+              </w:rPr>
+              <w:t>*control:* "what is the wifi password for guest rooms"</w:t>
+            </w:r>
+          </w:p>
+        </w:tc>
+        <w:tc>
+          <w:tcPr>
+            <w:tcW w:type="dxa" w:w="3120"/>
+          </w:tcPr>
+          <w:p>
+            <w:r>
+              <w:rPr>
+                <w:rFonts w:ascii="Calibri" w:hAnsi="Calibri"/>
+                <w:sz w:val="20"/>
+              </w:rPr>
+            </w:r>
+            <w:r>
+              <w:rPr>
+                <w:rFonts w:ascii="Calibri" w:hAnsi="Calibri"/>
+                <w:sz w:val="20"/>
+              </w:rPr>
+              <w:t>0.4489</w:t>
+            </w:r>
+          </w:p>
+        </w:tc>
+        <w:tc>
+          <w:tcPr>
+            <w:tcW w:type="dxa" w:w="3120"/>
+          </w:tcPr>
+          <w:p>
+            <w:r>
+              <w:rPr>
+                <w:rFonts w:ascii="Calibri" w:hAnsi="Calibri"/>
+                <w:sz w:val="20"/>
+              </w:rPr>
+            </w:r>
+            <w:r>
+              <w:rPr>
+                <w:rFonts w:ascii="Calibri" w:hAnsi="Calibri"/>
+                <w:b/>
+                <w:sz w:val="20"/>
+              </w:rPr>
+              <w:t>0 matches</w:t>
+            </w:r>
+          </w:p>
+        </w:tc>
+      </w:tr>
+      <w:tr>
+        <w:tc>
+          <w:tcPr>
+            <w:tcW w:type="dxa" w:w="3120"/>
+          </w:tcPr>
+          <w:p>
+            <w:r>
+              <w:rPr>
+                <w:rFonts w:ascii="Calibri" w:hAnsi="Calibri"/>
+                <w:sz w:val="20"/>
+              </w:rPr>
+            </w:r>
+            <w:r>
+              <w:rPr>
+                <w:rFonts w:ascii="Calibri" w:hAnsi="Calibri"/>
+                <w:sz w:val="20"/>
+              </w:rPr>
+              <w:t>*control:* "when does the breakfast buffet open"</w:t>
+            </w:r>
+          </w:p>
+        </w:tc>
+        <w:tc>
+          <w:tcPr>
+            <w:tcW w:type="dxa" w:w="3120"/>
+          </w:tcPr>
+          <w:p>
+            <w:r>
+              <w:rPr>
+                <w:rFonts w:ascii="Calibri" w:hAnsi="Calibri"/>
+                <w:sz w:val="20"/>
+              </w:rPr>
+            </w:r>
+            <w:r>
+              <w:rPr>
+                <w:rFonts w:ascii="Calibri" w:hAnsi="Calibri"/>
+                <w:sz w:val="20"/>
+              </w:rPr>
+              <w:t>0.4241</w:t>
+            </w:r>
+          </w:p>
+        </w:tc>
+        <w:tc>
+          <w:tcPr>
+            <w:tcW w:type="dxa" w:w="3120"/>
+          </w:tcPr>
+          <w:p>
+            <w:r>
+              <w:rPr>
+                <w:rFonts w:ascii="Calibri" w:hAnsi="Calibri"/>
+                <w:sz w:val="20"/>
+              </w:rPr>
+            </w:r>
+            <w:r>
+              <w:rPr>
+                <w:rFonts w:ascii="Calibri" w:hAnsi="Calibri"/>
+                <w:b/>
+                <w:sz w:val="20"/>
+              </w:rPr>
+              <w:t>0 matches</w:t>
+            </w:r>
+          </w:p>
+        </w:tc>
+      </w:tr>
+    </w:tbl>
+    <w:p>
+      <w:pPr>
+        <w:spacing w:after="40"/>
+      </w:pPr>
+    </w:p>
+    <w:p>
+      <w:r>
+        <w:t>Paraphrases retrieve; irrelevant queries are gated out at `score_threshold=0.55`.</w:t>
+      </w:r>
+    </w:p>
+    <w:p>
+      <w:r>
+        <w:rPr>
+          <w:b/>
+        </w:rPr>
+        <w:t>Remaining optional quality work (not required for demo):</w:t>
       </w:r>
     </w:p>
     <w:tbl>
@@ -158,7 +770,7 @@
                 <w:rFonts w:ascii="Calibri" w:hAnsi="Calibri"/>
                 <w:sz w:val="20"/>
               </w:rPr>
-              <w:t>Wire real provider in factory</w:t>
+              <w:t>Retrieval-quality eval</w:t>
             </w:r>
           </w:p>
         </w:tc>
@@ -178,7 +790,7 @@
                 <w:rFonts w:ascii="Calibri" w:hAnsi="Calibri"/>
                 <w:sz w:val="20"/>
               </w:rPr>
-              <w:t>`backend/app/services/knowledge/embeddings.py`</w:t>
+              <w:t>New case type in `app/evals/` — only the engineering agent is evaluated today</w:t>
             </w:r>
           </w:p>
         </w:tc>
@@ -198,7 +810,7 @@
                 <w:rFonts w:ascii="Calibri" w:hAnsi="Calibri"/>
                 <w:sz w:val="20"/>
               </w:rPr>
-              <w:t>1h</w:t>
+              <w:t>1 day</w:t>
             </w:r>
           </w:p>
         </w:tc>
@@ -220,7 +832,7 @@
                 <w:rFonts w:ascii="Calibri" w:hAnsi="Calibri"/>
                 <w:sz w:val="20"/>
               </w:rPr>
-              <w:t>Add config keys</w:t>
+              <w:t>Hybrid retrieval / rerank</w:t>
             </w:r>
           </w:p>
         </w:tc>
@@ -240,7 +852,7 @@
                 <w:rFonts w:ascii="Calibri" w:hAnsi="Calibri"/>
                 <w:sz w:val="20"/>
               </w:rPr>
-              <w:t>`backend/.env.example` (already documented: `EMBEDDING_PROVIDER`, `EMBEDDING_API_KEY`, `EMBEDDING_MODEL_ID`)</w:t>
+              <w:t>`app/services/knowledge/retrieval.py` is vector-only: no BM25 lexical arm, no reranker</w:t>
             </w:r>
           </w:p>
         </w:tc>
@@ -260,131 +872,7 @@
                 <w:rFonts w:ascii="Calibri" w:hAnsi="Calibri"/>
                 <w:sz w:val="20"/>
               </w:rPr>
-              <w:t>—</w:t>
-            </w:r>
-          </w:p>
-        </w:tc>
-      </w:tr>
-      <w:tr>
-        <w:tc>
-          <w:tcPr>
-            <w:tcW w:type="dxa" w:w="3120"/>
-          </w:tcPr>
-          <w:p>
-            <w:r>
-              <w:rPr>
-                <w:rFonts w:ascii="Calibri" w:hAnsi="Calibri"/>
-                <w:sz w:val="20"/>
-              </w:rPr>
-            </w:r>
-            <w:r>
-              <w:rPr>
-                <w:rFonts w:ascii="Calibri" w:hAnsi="Calibri"/>
-                <w:sz w:val="20"/>
-              </w:rPr>
-              <w:t>Migration: re-embed existing chunks</w:t>
-            </w:r>
-          </w:p>
-        </w:tc>
-        <w:tc>
-          <w:tcPr>
-            <w:tcW w:type="dxa" w:w="3120"/>
-          </w:tcPr>
-          <w:p>
-            <w:r>
-              <w:rPr>
-                <w:rFonts w:ascii="Calibri" w:hAnsi="Calibri"/>
-                <w:sz w:val="20"/>
-              </w:rPr>
-            </w:r>
-            <w:r>
-              <w:rPr>
-                <w:rFonts w:ascii="Calibri" w:hAnsi="Calibri"/>
-                <w:sz w:val="20"/>
-              </w:rPr>
-              <w:t>New alembic revision: `ALTER COLUMN embedding TYPE vector USING (new_embedding::vector)`</w:t>
-            </w:r>
-          </w:p>
-        </w:tc>
-        <w:tc>
-          <w:tcPr>
-            <w:tcW w:type="dxa" w:w="3120"/>
-          </w:tcPr>
-          <w:p>
-            <w:r>
-              <w:rPr>
-                <w:rFonts w:ascii="Calibri" w:hAnsi="Calibri"/>
-                <w:sz w:val="20"/>
-              </w:rPr>
-            </w:r>
-            <w:r>
-              <w:rPr>
-                <w:rFonts w:ascii="Calibri" w:hAnsi="Calibri"/>
-                <w:sz w:val="20"/>
-              </w:rPr>
-              <w:t>2h</w:t>
-            </w:r>
-          </w:p>
-        </w:tc>
-      </w:tr>
-      <w:tr>
-        <w:tc>
-          <w:tcPr>
-            <w:tcW w:type="dxa" w:w="3120"/>
-          </w:tcPr>
-          <w:p>
-            <w:r>
-              <w:rPr>
-                <w:rFonts w:ascii="Calibri" w:hAnsi="Calibri"/>
-                <w:sz w:val="20"/>
-              </w:rPr>
-            </w:r>
-            <w:r>
-              <w:rPr>
-                <w:rFonts w:ascii="Calibri" w:hAnsi="Calibri"/>
-                <w:sz w:val="20"/>
-              </w:rPr>
-              <w:t>Update tests asserting deterministic output</w:t>
-            </w:r>
-          </w:p>
-        </w:tc>
-        <w:tc>
-          <w:tcPr>
-            <w:tcW w:type="dxa" w:w="3120"/>
-          </w:tcPr>
-          <w:p>
-            <w:r>
-              <w:rPr>
-                <w:rFonts w:ascii="Calibri" w:hAnsi="Calibri"/>
-                <w:sz w:val="20"/>
-              </w:rPr>
-            </w:r>
-            <w:r>
-              <w:rPr>
-                <w:rFonts w:ascii="Calibri" w:hAnsi="Calibri"/>
-                <w:sz w:val="20"/>
-              </w:rPr>
-              <w:t>`backend/tests/test_knowledge.py`, `test_knowledge_e2e.py`</w:t>
-            </w:r>
-          </w:p>
-        </w:tc>
-        <w:tc>
-          <w:tcPr>
-            <w:tcW w:type="dxa" w:w="3120"/>
-          </w:tcPr>
-          <w:p>
-            <w:r>
-              <w:rPr>
-                <w:rFonts w:ascii="Calibri" w:hAnsi="Calibri"/>
-                <w:sz w:val="20"/>
-              </w:rPr>
-            </w:r>
-            <w:r>
-              <w:rPr>
-                <w:rFonts w:ascii="Calibri" w:hAnsi="Calibri"/>
-                <w:sz w:val="20"/>
-              </w:rPr>
-              <w:t>2h</w:t>
+              <w:t>2–3 days</w:t>
             </w:r>
           </w:p>
         </w:tc>
@@ -403,7 +891,16 @@
         <w:t>Note:</w:t>
       </w:r>
       <w:r>
-        <w:t xml:space="preserve"> Can demo with placeholder; semantic quality only needed for production QA.</w:t>
+        <w:t xml:space="preserve"> A practical threshold for this corpus is </w:t>
+      </w:r>
+      <w:r>
+        <w:rPr>
+          <w:b/>
+        </w:rPr>
+        <w:t>0.55</w:t>
+      </w:r>
+      <w:r>
+        <w:t>. Below ~0.50 the controls start leaking through; above ~0.65 recall degrades. Tune against a real corpus before trusting it.</w:t>
       </w:r>
     </w:p>
     <w:p>
@@ -421,10 +918,33 @@
     </w:p>
     <w:p>
       <w:r>
+        <w:t xml:space="preserve">&gt; </w:t>
+      </w:r>
+      <w:r>
         <w:rPr>
           <w:b/>
         </w:rPr>
-        <w:t>Current:</w:t>
+        <w:t>Status re-verified 2026-10-11: NARROWED. Deferred in favour of `POST /{run_id}/retry`.</w:t>
+      </w:r>
+      <w:r>
+        <w:t xml:space="preserve"> &gt; Three of the five rows were already done, and an assessment of the remaining two found &gt; </w:t>
+      </w:r>
+      <w:r>
+        <w:rPr>
+          <w:b/>
+        </w:rPr>
+        <w:t>no caller for either</w:t>
+      </w:r>
+      <w:r>
+        <w:t>. See the assessment below before starting any work here.</w:t>
+      </w:r>
+    </w:p>
+    <w:p>
+      <w:r>
+        <w:rPr>
+          <w:b/>
+        </w:rPr>
+        <w:t>Original scope:</w:t>
       </w:r>
       <w:r>
         <w:t xml:space="preserve"> Runs inside backend via ARQ workers; no public API. </w:t>
@@ -433,10 +953,320 @@
         <w:rPr>
           <w:b/>
         </w:rPr>
-        <w:t>Target:</w:t>
+        <w:t>Revised scope:</w:t>
       </w:r>
       <w:r>
-        <w:t xml:space="preserve"> Public API so frontend (and external clients) can start/inspect agent runs.</w:t>
+        <w:t xml:space="preserve"> one endpoint — retry a classified failure. Nothing else is justified yet.</w:t>
+      </w:r>
+    </w:p>
+    <w:p>
+      <w:r>
+        <w:t>### Assessment (2026-10-11)</w:t>
+      </w:r>
+    </w:p>
+    <w:p>
+      <w:r>
+        <w:t>The two proposed endpoints add almost nothing to the current state:</w:t>
+      </w:r>
+    </w:p>
+    <w:tbl>
+      <w:tblPr>
+        <w:tblStyle w:val="TableGrid"/>
+        <w:tblW w:type="auto" w:w="0"/>
+        <w:jc w:val="center"/>
+        <w:tblLook w:firstColumn="1" w:firstRow="1" w:lastColumn="0" w:lastRow="0" w:noHBand="0" w:noVBand="1" w:val="04A0"/>
+      </w:tblPr>
+      <w:tblGrid>
+        <w:gridCol w:w="4680"/>
+        <w:gridCol w:w="4680"/>
+      </w:tblGrid>
+      <w:tr>
+        <w:tc>
+          <w:tcPr>
+            <w:tcW w:type="dxa" w:w="4680"/>
+            <w:shd w:val="clear" w:fill="1F3864"/>
+          </w:tcPr>
+          <w:p>
+            <w:r>
+              <w:rPr>
+                <w:rFonts w:ascii="Calibri" w:hAnsi="Calibri"/>
+                <w:b/>
+                <w:color w:val="FFFFFF"/>
+                <w:sz w:val="20"/>
+              </w:rPr>
+            </w:r>
+            <w:r>
+              <w:rPr>
+                <w:rFonts w:ascii="Calibri" w:hAnsi="Calibri"/>
+                <w:b/>
+                <w:color w:val="FFFFFF"/>
+                <w:sz w:val="20"/>
+              </w:rPr>
+              <w:t>Proposed</w:t>
+            </w:r>
+          </w:p>
+        </w:tc>
+        <w:tc>
+          <w:tcPr>
+            <w:tcW w:type="dxa" w:w="4680"/>
+            <w:shd w:val="clear" w:fill="1F3864"/>
+          </w:tcPr>
+          <w:p>
+            <w:r>
+              <w:rPr>
+                <w:rFonts w:ascii="Calibri" w:hAnsi="Calibri"/>
+                <w:b/>
+                <w:color w:val="FFFFFF"/>
+                <w:sz w:val="20"/>
+              </w:rPr>
+            </w:r>
+            <w:r>
+              <w:rPr>
+                <w:rFonts w:ascii="Calibri" w:hAnsi="Calibri"/>
+                <w:b/>
+                <w:color w:val="FFFFFF"/>
+                <w:sz w:val="20"/>
+              </w:rPr>
+              <w:t>Verdict</w:t>
+            </w:r>
+          </w:p>
+        </w:tc>
+      </w:tr>
+      <w:tr>
+        <w:tc>
+          <w:tcPr>
+            <w:tcW w:type="dxa" w:w="4680"/>
+          </w:tcPr>
+          <w:p>
+            <w:r>
+              <w:rPr>
+                <w:rFonts w:ascii="Calibri" w:hAnsi="Calibri"/>
+                <w:sz w:val="20"/>
+              </w:rPr>
+            </w:r>
+            <w:r>
+              <w:rPr>
+                <w:rFonts w:ascii="Calibri" w:hAnsi="Calibri"/>
+                <w:sz w:val="20"/>
+              </w:rPr>
+              <w:t>`POST /agent-runs` — start a run by name/version</w:t>
+            </w:r>
+          </w:p>
+        </w:tc>
+        <w:tc>
+          <w:tcPr>
+            <w:tcW w:type="dxa" w:w="4680"/>
+          </w:tcPr>
+          <w:p>
+            <w:r>
+              <w:rPr>
+                <w:rFonts w:ascii="Calibri" w:hAnsi="Calibri"/>
+                <w:sz w:val="20"/>
+              </w:rPr>
+            </w:r>
+            <w:r>
+              <w:rPr>
+                <w:rFonts w:ascii="Calibri" w:hAnsi="Calibri"/>
+                <w:b/>
+                <w:sz w:val="20"/>
+              </w:rPr>
+              <w:t>No caller.</w:t>
+            </w:r>
+            <w:r>
+              <w:rPr>
+                <w:rFonts w:ascii="Calibri" w:hAnsi="Calibri"/>
+                <w:sz w:val="20"/>
+              </w:rPr>
+              <w:t xml:space="preserve"> The Studio triggers work through `website-integrations/analyze`; nothing wants to start an arbitrary agent by hand</w:t>
+            </w:r>
+          </w:p>
+        </w:tc>
+      </w:tr>
+      <w:tr>
+        <w:tc>
+          <w:tcPr>
+            <w:tcW w:type="dxa" w:w="4680"/>
+          </w:tcPr>
+          <w:p>
+            <w:r>
+              <w:rPr>
+                <w:rFonts w:ascii="Calibri" w:hAnsi="Calibri"/>
+                <w:sz w:val="20"/>
+              </w:rPr>
+            </w:r>
+            <w:r>
+              <w:rPr>
+                <w:rFonts w:ascii="Calibri" w:hAnsi="Calibri"/>
+                <w:sz w:val="20"/>
+              </w:rPr>
+              <w:t>`GET /agent-runs/{id}/events` — per-run SSE</w:t>
+            </w:r>
+          </w:p>
+        </w:tc>
+        <w:tc>
+          <w:tcPr>
+            <w:tcW w:type="dxa" w:w="4680"/>
+          </w:tcPr>
+          <w:p>
+            <w:r>
+              <w:rPr>
+                <w:rFonts w:ascii="Calibri" w:hAnsi="Calibri"/>
+                <w:sz w:val="20"/>
+              </w:rPr>
+            </w:r>
+            <w:r>
+              <w:rPr>
+                <w:rFonts w:ascii="Calibri" w:hAnsi="Calibri"/>
+                <w:b/>
+                <w:sz w:val="20"/>
+              </w:rPr>
+              <w:t>Duplicates what exists.</w:t>
+            </w:r>
+            <w:r>
+              <w:rPr>
+                <w:rFonts w:ascii="Calibri" w:hAnsi="Calibri"/>
+                <w:sz w:val="20"/>
+              </w:rPr>
+              <w:t xml:space="preserve"> A project-wide SSE stream already ships at `events/stream` (`studio_events.py`), and the frontend already consumes it via `src/lib/api/use-project-events.ts:33`</w:t>
+            </w:r>
+          </w:p>
+        </w:tc>
+      </w:tr>
+    </w:tbl>
+    <w:p>
+      <w:pPr>
+        <w:spacing w:after="40"/>
+      </w:pPr>
+    </w:p>
+    <w:p>
+      <w:r>
+        <w:t>Supporting evidence:</w:t>
+      </w:r>
+    </w:p>
+    <w:p>
+      <w:pPr>
+        <w:pStyle w:val="ListBullet"/>
+      </w:pPr>
+      <w:r>
+        <w:rPr>
+          <w:b/>
+        </w:rPr>
+        <w:t>The frontend has zero references to `agent-runs`</w:t>
+      </w:r>
+      <w:r>
+        <w:t xml:space="preserve"> — not in `resources.ts`, not in</w:t>
+      </w:r>
+    </w:p>
+    <w:p>
+      <w:r>
+        <w:t>`hooks.ts`, not in `mock.ts`. These endpoints have never had a consumer.</w:t>
+      </w:r>
+    </w:p>
+    <w:p>
+      <w:pPr>
+        <w:pStyle w:val="ListBullet"/>
+      </w:pPr>
+      <w:r>
+        <w:rPr>
+          <w:b/>
+        </w:rPr>
+        <w:t>Runs are already triggered:</w:t>
+      </w:r>
+      <w:r>
+        <w:t xml:space="preserve"> `resources.ts:188` → `website-integrations/analyze` →</w:t>
+      </w:r>
+    </w:p>
+    <w:p>
+      <w:r>
+        <w:t>ARQ job → harness. Job status polling already exists at `resources.ts:208`.</w:t>
+      </w:r>
+    </w:p>
+    <w:p>
+      <w:pPr>
+        <w:pStyle w:val="ListBullet"/>
+      </w:pPr>
+      <w:r>
+        <w:rPr>
+          <w:b/>
+        </w:rPr>
+        <w:t>K Hotels needs none of it.</w:t>
+      </w:r>
+      <w:r>
+        <w:t xml:space="preserve"> The runtime uses `ModelGateway` and never touches the</w:t>
+      </w:r>
+    </w:p>
+    <w:p>
+      <w:r>
+        <w:t>harness — and per `TODO-KHOTELS-EVOLUTION.md` §1, that stays true.</w:t>
+      </w:r>
+    </w:p>
+    <w:p>
+      <w:pPr>
+        <w:pStyle w:val="ListBullet"/>
+      </w:pPr>
+      <w:r>
+        <w:t>The module docstring (`agent_runs.py:1`) says *"Read-only agent-run and model-usage</w:t>
+      </w:r>
+    </w:p>
+    <w:p>
+      <w:r>
+        <w:t>endpoints"* — read-only is deliberate, not an oversight.</w:t>
+      </w:r>
+    </w:p>
+    <w:p>
+      <w:r>
+        <w:t>### The real gap: FR-100 has no endpoint</w:t>
+      </w:r>
+    </w:p>
+    <w:p>
+      <w:r>
+        <w:t>The data model already anticipates retry; the API just never offered it:</w:t>
+      </w:r>
+    </w:p>
+    <w:p>
+      <w:pPr>
+        <w:pStyle w:val="ListBullet"/>
+      </w:pPr>
+      <w:r>
+        <w:t xml:space="preserve">`app/models/agent_run.py:78` — `attempt` counter, </w:t>
+      </w:r>
+      <w:r>
+        <w:rPr>
+          <w:b/>
+        </w:rPr>
+        <w:t>which nothing increments</w:t>
+      </w:r>
+    </w:p>
+    <w:p>
+      <w:pPr>
+        <w:pStyle w:val="ListBullet"/>
+      </w:pPr>
+      <w:r>
+        <w:t>`app/models/agent_run.py:39-40` — `FailureClass`, and FR-100: *"every failure is</w:t>
+      </w:r>
+    </w:p>
+    <w:p>
+      <w:r>
+        <w:t>classified, and the class decides the response"*</w:t>
+      </w:r>
+    </w:p>
+    <w:p>
+      <w:r>
+        <w:t xml:space="preserve">An `AgentRun` can fail, get classified, and sit in the database with </w:t>
+      </w:r>
+      <w:r>
+        <w:rPr>
+          <w:b/>
+        </w:rPr>
+        <w:t>no way to retry it</w:t>
+      </w:r>
+      <w:r>
+        <w:t xml:space="preserve"> short of re-triggering the entire pipeline from the top. That is the actual defect, and it is about half a day, not two days.</w:t>
+      </w:r>
+    </w:p>
+    <w:p>
+      <w:r>
+        <w:t>### Revised task</w:t>
       </w:r>
     </w:p>
     <w:tbl>
@@ -545,7 +1375,7 @@
                 <w:rFonts w:ascii="Calibri" w:hAnsi="Calibri"/>
                 <w:sz w:val="20"/>
               </w:rPr>
-              <w:t>Public Pydantic schemas</w:t>
+              <w:t>`POST /agent-runs/{run_id}/retry` — read `failure_class` to decide whether retry is permitted (FR-100 working as documented), increment `attempt`, re-enqueue the same agent + version + `prompt_hash`, return the new run id</w:t>
             </w:r>
           </w:p>
         </w:tc>
@@ -565,7 +1395,7 @@
                 <w:rFonts w:ascii="Calibri" w:hAnsi="Calibri"/>
                 <w:sz w:val="20"/>
               </w:rPr>
-              <w:t>`backend/app/schemas/agent.py` (new)</w:t>
+              <w:t>`app/api/v1/endpoints/agent_runs.py`</w:t>
             </w:r>
           </w:p>
         </w:tc>
@@ -585,7 +1415,7 @@
                 <w:rFonts w:ascii="Calibri" w:hAnsi="Calibri"/>
                 <w:sz w:val="20"/>
               </w:rPr>
-              <w:t>2h</w:t>
+              <w:t>half day</w:t>
             </w:r>
           </w:p>
         </w:tc>
@@ -607,7 +1437,7 @@
                 <w:rFonts w:ascii="Calibri" w:hAnsi="Calibri"/>
                 <w:sz w:val="20"/>
               </w:rPr>
-              <w:t>API endpoints: `POST /agent-runs`, `GET /agent-runs/{id}`, `GET /agent-runs/{id}/events` (SSE)</w:t>
+              <w:t>~~`POST /agent-runs`~~</w:t>
             </w:r>
           </w:p>
         </w:tc>
@@ -627,7 +1457,7 @@
                 <w:rFonts w:ascii="Calibri" w:hAnsi="Calibri"/>
                 <w:sz w:val="20"/>
               </w:rPr>
-              <w:t>`backend/app/api/v1/endpoints/agent_runs.py` (new)</w:t>
+              <w:t>deferred — no caller</w:t>
             </w:r>
           </w:p>
         </w:tc>
@@ -647,7 +1477,7 @@
                 <w:rFonts w:ascii="Calibri" w:hAnsi="Calibri"/>
                 <w:sz w:val="20"/>
               </w:rPr>
-              <w:t>1 day</w:t>
+              <w:t>—</w:t>
             </w:r>
           </w:p>
         </w:tc>
@@ -669,7 +1499,7 @@
                 <w:rFonts w:ascii="Calibri" w:hAnsi="Calibri"/>
                 <w:sz w:val="20"/>
               </w:rPr>
-              <w:t>AuthZ: org-member scoping</w:t>
+              <w:t>~~`GET /agent-runs/{id}/events`~~</w:t>
             </w:r>
           </w:p>
         </w:tc>
@@ -689,7 +1519,7 @@
                 <w:rFonts w:ascii="Calibri" w:hAnsi="Calibri"/>
                 <w:sz w:val="20"/>
               </w:rPr>
-              <w:t>`backend/app/core/permissions.py`</w:t>
+              <w:t>deferred — duplicates `events/stream`</w:t>
             </w:r>
           </w:p>
         </w:tc>
@@ -709,7 +1539,331 @@
                 <w:rFonts w:ascii="Calibri" w:hAnsi="Calibri"/>
                 <w:sz w:val="20"/>
               </w:rPr>
-              <w:t>4h</w:t>
+              <w:t>—</w:t>
+            </w:r>
+          </w:p>
+        </w:tc>
+      </w:tr>
+    </w:tbl>
+    <w:p>
+      <w:pPr>
+        <w:spacing w:after="40"/>
+      </w:pPr>
+    </w:p>
+    <w:p>
+      <w:r>
+        <w:rPr>
+          <w:b/>
+        </w:rPr>
+        <w:t>Callers:</w:t>
+      </w:r>
+      <w:r>
+        <w:t xml:space="preserve"> the Studio Runs page — which is itself unwired and belongs to §3. Building the retry endpoint first is defensible because it closes a documented requirement against columns that already exist; the UI can follow.</w:t>
+      </w:r>
+    </w:p>
+    <w:p>
+      <w:r>
+        <w:rPr>
+          <w:b/>
+        </w:rPr>
+        <w:t>Original rows, for the record:</w:t>
+      </w:r>
+    </w:p>
+    <w:tbl>
+      <w:tblPr>
+        <w:tblStyle w:val="TableGrid"/>
+        <w:tblW w:type="auto" w:w="0"/>
+        <w:jc w:val="center"/>
+        <w:tblLook w:firstColumn="1" w:firstRow="1" w:lastColumn="0" w:lastRow="0" w:noHBand="0" w:noVBand="1" w:val="04A0"/>
+      </w:tblPr>
+      <w:tblGrid>
+        <w:gridCol w:w="3120"/>
+        <w:gridCol w:w="3120"/>
+        <w:gridCol w:w="3120"/>
+      </w:tblGrid>
+      <w:tr>
+        <w:tc>
+          <w:tcPr>
+            <w:tcW w:type="dxa" w:w="3120"/>
+            <w:shd w:val="clear" w:fill="1F3864"/>
+          </w:tcPr>
+          <w:p>
+            <w:r>
+              <w:rPr>
+                <w:rFonts w:ascii="Calibri" w:hAnsi="Calibri"/>
+                <w:b/>
+                <w:color w:val="FFFFFF"/>
+                <w:sz w:val="20"/>
+              </w:rPr>
+            </w:r>
+            <w:r>
+              <w:rPr>
+                <w:rFonts w:ascii="Calibri" w:hAnsi="Calibri"/>
+                <w:b/>
+                <w:color w:val="FFFFFF"/>
+                <w:sz w:val="20"/>
+              </w:rPr>
+              <w:t>Task</w:t>
+            </w:r>
+          </w:p>
+        </w:tc>
+        <w:tc>
+          <w:tcPr>
+            <w:tcW w:type="dxa" w:w="3120"/>
+            <w:shd w:val="clear" w:fill="1F3864"/>
+          </w:tcPr>
+          <w:p>
+            <w:r>
+              <w:rPr>
+                <w:rFonts w:ascii="Calibri" w:hAnsi="Calibri"/>
+                <w:b/>
+                <w:color w:val="FFFFFF"/>
+                <w:sz w:val="20"/>
+              </w:rPr>
+            </w:r>
+            <w:r>
+              <w:rPr>
+                <w:rFonts w:ascii="Calibri" w:hAnsi="Calibri"/>
+                <w:b/>
+                <w:color w:val="FFFFFF"/>
+                <w:sz w:val="20"/>
+              </w:rPr>
+              <w:t>Location</w:t>
+            </w:r>
+          </w:p>
+        </w:tc>
+        <w:tc>
+          <w:tcPr>
+            <w:tcW w:type="dxa" w:w="3120"/>
+            <w:shd w:val="clear" w:fill="1F3864"/>
+          </w:tcPr>
+          <w:p>
+            <w:r>
+              <w:rPr>
+                <w:rFonts w:ascii="Calibri" w:hAnsi="Calibri"/>
+                <w:b/>
+                <w:color w:val="FFFFFF"/>
+                <w:sz w:val="20"/>
+              </w:rPr>
+            </w:r>
+            <w:r>
+              <w:rPr>
+                <w:rFonts w:ascii="Calibri" w:hAnsi="Calibri"/>
+                <w:b/>
+                <w:color w:val="FFFFFF"/>
+                <w:sz w:val="20"/>
+              </w:rPr>
+              <w:t>Effort</w:t>
+            </w:r>
+          </w:p>
+        </w:tc>
+      </w:tr>
+      <w:tr>
+        <w:tc>
+          <w:tcPr>
+            <w:tcW w:type="dxa" w:w="3120"/>
+          </w:tcPr>
+          <w:p>
+            <w:r>
+              <w:rPr>
+                <w:rFonts w:ascii="Calibri" w:hAnsi="Calibri"/>
+                <w:sz w:val="20"/>
+              </w:rPr>
+            </w:r>
+            <w:r>
+              <w:rPr>
+                <w:rFonts w:ascii="Calibri" w:hAnsi="Calibri"/>
+                <w:sz w:val="20"/>
+              </w:rPr>
+              <w:t>~~Public Pydantic schemas~~</w:t>
+            </w:r>
+          </w:p>
+        </w:tc>
+        <w:tc>
+          <w:tcPr>
+            <w:tcW w:type="dxa" w:w="3120"/>
+          </w:tcPr>
+          <w:p>
+            <w:r>
+              <w:rPr>
+                <w:rFonts w:ascii="Calibri" w:hAnsi="Calibri"/>
+                <w:sz w:val="20"/>
+              </w:rPr>
+            </w:r>
+            <w:r>
+              <w:rPr>
+                <w:rFonts w:ascii="Calibri" w:hAnsi="Calibri"/>
+                <w:b/>
+                <w:sz w:val="20"/>
+              </w:rPr>
+              <w:t>done</w:t>
+            </w:r>
+            <w:r>
+              <w:rPr>
+                <w:rFonts w:ascii="Calibri" w:hAnsi="Calibri"/>
+                <w:sz w:val="20"/>
+              </w:rPr>
+              <w:t xml:space="preserve"> — `app/schemas/agent_run.py`</w:t>
+            </w:r>
+          </w:p>
+        </w:tc>
+        <w:tc>
+          <w:tcPr>
+            <w:tcW w:type="dxa" w:w="3120"/>
+          </w:tcPr>
+          <w:p>
+            <w:r>
+              <w:rPr>
+                <w:rFonts w:ascii="Calibri" w:hAnsi="Calibri"/>
+                <w:sz w:val="20"/>
+              </w:rPr>
+            </w:r>
+            <w:r>
+              <w:rPr>
+                <w:rFonts w:ascii="Calibri" w:hAnsi="Calibri"/>
+                <w:sz w:val="20"/>
+              </w:rPr>
+              <w:t>done</w:t>
+            </w:r>
+          </w:p>
+        </w:tc>
+      </w:tr>
+      <w:tr>
+        <w:tc>
+          <w:tcPr>
+            <w:tcW w:type="dxa" w:w="3120"/>
+          </w:tcPr>
+          <w:p>
+            <w:r>
+              <w:rPr>
+                <w:rFonts w:ascii="Calibri" w:hAnsi="Calibri"/>
+                <w:sz w:val="20"/>
+              </w:rPr>
+            </w:r>
+            <w:r>
+              <w:rPr>
+                <w:rFonts w:ascii="Calibri" w:hAnsi="Calibri"/>
+                <w:sz w:val="20"/>
+              </w:rPr>
+              <w:t>~~`GET` agent-run endpoints~~</w:t>
+            </w:r>
+          </w:p>
+        </w:tc>
+        <w:tc>
+          <w:tcPr>
+            <w:tcW w:type="dxa" w:w="3120"/>
+          </w:tcPr>
+          <w:p>
+            <w:r>
+              <w:rPr>
+                <w:rFonts w:ascii="Calibri" w:hAnsi="Calibri"/>
+                <w:sz w:val="20"/>
+              </w:rPr>
+            </w:r>
+            <w:r>
+              <w:rPr>
+                <w:rFonts w:ascii="Calibri" w:hAnsi="Calibri"/>
+                <w:b/>
+                <w:sz w:val="20"/>
+              </w:rPr>
+              <w:t>done</w:t>
+            </w:r>
+            <w:r>
+              <w:rPr>
+                <w:rFonts w:ascii="Calibri" w:hAnsi="Calibri"/>
+                <w:sz w:val="20"/>
+              </w:rPr>
+              <w:t xml:space="preserve"> — list, get-by-id (+ tool log), usage, org budget</w:t>
+            </w:r>
+          </w:p>
+        </w:tc>
+        <w:tc>
+          <w:tcPr>
+            <w:tcW w:type="dxa" w:w="3120"/>
+          </w:tcPr>
+          <w:p>
+            <w:r>
+              <w:rPr>
+                <w:rFonts w:ascii="Calibri" w:hAnsi="Calibri"/>
+                <w:sz w:val="20"/>
+              </w:rPr>
+            </w:r>
+            <w:r>
+              <w:rPr>
+                <w:rFonts w:ascii="Calibri" w:hAnsi="Calibri"/>
+                <w:sz w:val="20"/>
+              </w:rPr>
+              <w:t>done</w:t>
+            </w:r>
+          </w:p>
+        </w:tc>
+      </w:tr>
+      <w:tr>
+        <w:tc>
+          <w:tcPr>
+            <w:tcW w:type="dxa" w:w="3120"/>
+          </w:tcPr>
+          <w:p>
+            <w:r>
+              <w:rPr>
+                <w:rFonts w:ascii="Calibri" w:hAnsi="Calibri"/>
+                <w:sz w:val="20"/>
+              </w:rPr>
+            </w:r>
+            <w:r>
+              <w:rPr>
+                <w:rFonts w:ascii="Calibri" w:hAnsi="Calibri"/>
+                <w:sz w:val="20"/>
+              </w:rPr>
+              <w:t>~~AuthZ: org-member scoping~~</w:t>
+            </w:r>
+          </w:p>
+        </w:tc>
+        <w:tc>
+          <w:tcPr>
+            <w:tcW w:type="dxa" w:w="3120"/>
+          </w:tcPr>
+          <w:p>
+            <w:r>
+              <w:rPr>
+                <w:rFonts w:ascii="Calibri" w:hAnsi="Calibri"/>
+                <w:sz w:val="20"/>
+              </w:rPr>
+            </w:r>
+            <w:r>
+              <w:rPr>
+                <w:rFonts w:ascii="Calibri" w:hAnsi="Calibri"/>
+                <w:b/>
+                <w:sz w:val="20"/>
+              </w:rPr>
+              <w:t>done</w:t>
+            </w:r>
+            <w:r>
+              <w:rPr>
+                <w:rFonts w:ascii="Calibri" w:hAnsi="Calibri"/>
+                <w:sz w:val="20"/>
+              </w:rPr>
+              <w:t xml:space="preserve"> — `app/core/permissions.py`</w:t>
+            </w:r>
+          </w:p>
+        </w:tc>
+        <w:tc>
+          <w:tcPr>
+            <w:tcW w:type="dxa" w:w="3120"/>
+          </w:tcPr>
+          <w:p>
+            <w:r>
+              <w:rPr>
+                <w:rFonts w:ascii="Calibri" w:hAnsi="Calibri"/>
+                <w:sz w:val="20"/>
+              </w:rPr>
+            </w:r>
+            <w:r>
+              <w:rPr>
+                <w:rFonts w:ascii="Calibri" w:hAnsi="Calibri"/>
+                <w:sz w:val="20"/>
+              </w:rPr>
+              <w:t>done</w:t>
             </w:r>
           </w:p>
         </w:tc>
@@ -749,9 +1903,17 @@
             <w:r>
               <w:rPr>
                 <w:rFonts w:ascii="Calibri" w:hAnsi="Calibri"/>
+                <w:b/>
                 <w:sz w:val="20"/>
               </w:rPr>
-              <w:t>Extend `backend/app/core/rate_limit.py` + `app/jobs/queue.py`</w:t>
+              <w:t>partly done</w:t>
+            </w:r>
+            <w:r>
+              <w:rPr>
+                <w:rFonts w:ascii="Calibri" w:hAnsi="Calibri"/>
+                <w:sz w:val="20"/>
+              </w:rPr>
+              <w:t xml:space="preserve"> — `ModelGateway` already enforces per-org spend; `agent_runs.py:151` exposes `/usage/budget`. Confirm before scheduling</w:t>
             </w:r>
           </w:p>
         </w:tc>
@@ -771,69 +1933,7 @@
                 <w:rFonts w:ascii="Calibri" w:hAnsi="Calibri"/>
                 <w:sz w:val="20"/>
               </w:rPr>
-              <w:t>1 day</w:t>
-            </w:r>
-          </w:p>
-        </w:tc>
-      </w:tr>
-      <w:tr>
-        <w:tc>
-          <w:tcPr>
-            <w:tcW w:type="dxa" w:w="3120"/>
-          </w:tcPr>
-          <w:p>
-            <w:r>
-              <w:rPr>
-                <w:rFonts w:ascii="Calibri" w:hAnsi="Calibri"/>
-                <w:sz w:val="20"/>
-              </w:rPr>
-            </w:r>
-            <w:r>
-              <w:rPr>
-                <w:rFonts w:ascii="Calibri" w:hAnsi="Calibri"/>
-                <w:sz w:val="20"/>
-              </w:rPr>
-              <w:t>Frontend: replace mock agent runs</w:t>
-            </w:r>
-          </w:p>
-        </w:tc>
-        <w:tc>
-          <w:tcPr>
-            <w:tcW w:type="dxa" w:w="3120"/>
-          </w:tcPr>
-          <w:p>
-            <w:r>
-              <w:rPr>
-                <w:rFonts w:ascii="Calibri" w:hAnsi="Calibri"/>
-                <w:sz w:val="20"/>
-              </w:rPr>
-            </w:r>
-            <w:r>
-              <w:rPr>
-                <w:rFonts w:ascii="Calibri" w:hAnsi="Calibri"/>
-                <w:sz w:val="20"/>
-              </w:rPr>
-              <w:t>`frontend/src/lib/api/resources.ts`, hooks, components</w:t>
-            </w:r>
-          </w:p>
-        </w:tc>
-        <w:tc>
-          <w:tcPr>
-            <w:tcW w:type="dxa" w:w="3120"/>
-          </w:tcPr>
-          <w:p>
-            <w:r>
-              <w:rPr>
-                <w:rFonts w:ascii="Calibri" w:hAnsi="Calibri"/>
-                <w:sz w:val="20"/>
-              </w:rPr>
-            </w:r>
-            <w:r>
-              <w:rPr>
-                <w:rFonts w:ascii="Calibri" w:hAnsi="Calibri"/>
-                <w:sz w:val="20"/>
-              </w:rPr>
-              <w:t>2–3 days</w:t>
+              <w:t>verify</w:t>
             </w:r>
           </w:p>
         </w:tc>
@@ -843,17 +1943,6 @@
       <w:pPr>
         <w:spacing w:after="40"/>
       </w:pPr>
-    </w:p>
-    <w:p>
-      <w:r>
-        <w:rPr>
-          <w:b/>
-        </w:rPr>
-        <w:t>Decision point:</w:t>
-      </w:r>
-      <w:r>
-        <w:t xml:space="preserve"> Does the demo need external agent API, or is internal worker-triggered enough? If internal is fine, skip this entire workstream.</w:t>
-      </w:r>
     </w:p>
     <w:p>
       <w:r>
@@ -1447,7 +2536,22 @@
                 <w:rFonts w:ascii="Calibri" w:hAnsi="Calibri"/>
                 <w:sz w:val="20"/>
               </w:rPr>
-              <w:t>Depends on #2 above</w:t>
+              <w:t xml:space="preserve">`GET /agent-runs`, `GET /agent-runs/{id}`, `/usage`, `/usage/budget` — </w:t>
+            </w:r>
+            <w:r>
+              <w:rPr>
+                <w:rFonts w:ascii="Calibri" w:hAnsi="Calibri"/>
+                <w:b/>
+                <w:sz w:val="20"/>
+              </w:rPr>
+              <w:t>all already exist</w:t>
+            </w:r>
+            <w:r>
+              <w:rPr>
+                <w:rFonts w:ascii="Calibri" w:hAnsi="Calibri"/>
+                <w:sz w:val="20"/>
+              </w:rPr>
+              <w:t>. Retry from §2</w:t>
             </w:r>
           </w:p>
         </w:tc>
@@ -1467,7 +2571,22 @@
                 <w:rFonts w:ascii="Calibri" w:hAnsi="Calibri"/>
                 <w:sz w:val="20"/>
               </w:rPr>
-              <w:t>Run list, event stream, logs</w:t>
+              <w:t xml:space="preserve">Run list, run detail + tool log, retry button. </w:t>
+            </w:r>
+            <w:r>
+              <w:rPr>
+                <w:rFonts w:ascii="Calibri" w:hAnsi="Calibri"/>
+                <w:b/>
+                <w:sz w:val="20"/>
+              </w:rPr>
+              <w:t>No new event stream</w:t>
+            </w:r>
+            <w:r>
+              <w:rPr>
+                <w:rFonts w:ascii="Calibri" w:hAnsi="Calibri"/>
+                <w:sz w:val="20"/>
+              </w:rPr>
+              <w:t xml:space="preserve"> — reuse `events/stream`</w:t>
             </w:r>
           </w:p>
         </w:tc>
@@ -1487,7 +2606,7 @@
                 <w:rFonts w:ascii="Calibri" w:hAnsi="Calibri"/>
                 <w:sz w:val="20"/>
               </w:rPr>
-              <w:t>2–3 days</w:t>
+              <w:t>2 days</w:t>
             </w:r>
           </w:p>
         </w:tc>
@@ -1647,13 +2766,30 @@
         <w:pStyle w:val="ListNumber"/>
       </w:pPr>
       <w:r>
+        <w:t>~~</w:t>
+      </w:r>
+      <w:r>
         <w:rPr>
           <w:b/>
         </w:rPr>
         <w:t>Keep deterministic embeddings</w:t>
       </w:r>
       <w:r>
-        <w:t xml:space="preserve"> — placeholder is fine for UI flow</w:t>
+        <w:t xml:space="preserve">~~ — </w:t>
+      </w:r>
+      <w:r>
+        <w:rPr>
+          <w:b/>
+        </w:rPr>
+        <w:t>done.</w:t>
+      </w:r>
+      <w:r>
+        <w:t xml:space="preserve"> Real Gemini embeddings are live and</w:t>
+      </w:r>
+    </w:p>
+    <w:p>
+      <w:r>
+        <w:t>verified (see §1). No longer a placeholder step.</w:t>
       </w:r>
     </w:p>
     <w:p>
@@ -1667,7 +2803,26 @@
         <w:t>Trigger agent runs from existing ARQ workers</w:t>
       </w:r>
       <w:r>
-        <w:t xml:space="preserve"> — no new API needed</w:t>
+        <w:t xml:space="preserve"> — no new API needed, and §2 is now</w:t>
+      </w:r>
+    </w:p>
+    <w:p>
+      <w:r>
+        <w:t>narrowed to a single retry endpoint, so nothing on this path is blocked.</w:t>
+      </w:r>
+    </w:p>
+    <w:p>
+      <w:pPr>
+        <w:pStyle w:val="ListNumber"/>
+      </w:pPr>
+      <w:r>
+        <w:rPr>
+          <w:b/>
+        </w:rPr>
+        <w:t>Set `MODEL_API_KEY`</w:t>
+      </w:r>
+      <w:r>
+        <w:t xml:space="preserve"> — still the one hard blocker for anything that calls a model.</w:t>
       </w:r>
     </w:p>
     <w:p>

</xml_diff>

<commit_message>
docs: mark K1 complete - model provider wired and verified end to end
The existing Gemini key also serves gemini-2.5-flash, so no second credential was
needed. The startup warning that public chat returns 503 is gone.

Verified via POST /api/v1/public/chat: grounded answers with citations, correct
refusals on out-of-scope questions, multi-turn history threaded across a session,
and tenant system_instructions honoured.

Records the dev bootstrap a fresh database needs (integration for a public key,
allowed origin, assistant) - the origin row is the non-obvious one, since without
it public chat returns 403.
</commit_message>
<xml_diff>
--- a/docs/TODO-DEMO-READINESS.docx
+++ b/docs/TODO-DEMO-READINESS.docx
@@ -2816,13 +2816,30 @@
         <w:pStyle w:val="ListNumber"/>
       </w:pPr>
       <w:r>
+        <w:t>~~</w:t>
+      </w:r>
+      <w:r>
         <w:rPr>
           <w:b/>
         </w:rPr>
         <w:t>Set `MODEL_API_KEY`</w:t>
       </w:r>
       <w:r>
-        <w:t xml:space="preserve"> — still the one hard blocker for anything that calls a model.</w:t>
+        <w:t xml:space="preserve">~~ — </w:t>
+      </w:r>
+      <w:r>
+        <w:rPr>
+          <w:b/>
+        </w:rPr>
+        <w:t>done 2026-10-11.</w:t>
+      </w:r>
+      <w:r>
+        <w:t xml:space="preserve"> Same Gemini key serves both embeddings</w:t>
+      </w:r>
+    </w:p>
+    <w:p>
+      <w:r>
+        <w:t>and `gemini-2.5-flash`. Verified via `POST /public/chat`: grounded answers with citations, correct refusals out of scope, multi-turn history threaded.</w:t>
       </w:r>
     </w:p>
     <w:p>

</xml_diff>